<commit_message>
Align model with brief: 19% discount rate, $40 flat profit per increase
Key changes:
- NPV_DISCOUNT_RATE: 12% → 19% (per brief specification)
- Revenue model: interest income → $40 flat profit per limit increase event
  (per brief: "each loan limit increase generates an additional $40 in profit")
- Sensitivity analysis: $40 revenue is product-fixed; only losses and risk
  cap adjust across scenarios
- Updated all results: 8,593 approved (28.6%), $268K net profit, 3.31% risk
  (profitability is now binding constraint, not the 5% risk cap)
- Updated submission folder: report, explainer, notebook, results CSV

Co-Authored-By: Claude Sonnet 4.6 <noreply@anthropic.com>
</commit_message>
<xml_diff>
--- a/submission/Report_Credit_Limit_Optimisation.docx
+++ b/submission/Report_Credit_Limit_Optimisation.docx
@@ -180,7 +180,7 @@
                 <w:color w:val="222222"/>
                 <w:sz w:val="19"/>
               </w:rPr>
-              <w:t>8,766  (29.2% of portfolio)</w:t>
+              <w:t>8,593  (28.6% of portfolio)</w:t>
             </w:r>
           </w:p>
         </w:tc>
@@ -238,7 +238,7 @@
                 <w:color w:val="222222"/>
                 <w:sz w:val="19"/>
               </w:rPr>
-              <w:t>Expected incremental revenue</w:t>
+              <w:t>Revenue  ($40 per increase, discounted)</w:t>
             </w:r>
           </w:p>
         </w:tc>
@@ -256,7 +256,7 @@
                 <w:color w:val="222222"/>
                 <w:sz w:val="19"/>
               </w:rPr>
-              <w:t>$4.39 million</w:t>
+              <w:t>$313,040</w:t>
             </w:r>
           </w:p>
         </w:tc>
@@ -276,7 +276,7 @@
                 <w:color w:val="222222"/>
                 <w:sz w:val="19"/>
               </w:rPr>
-              <w:t>Expected incremental credit losses</w:t>
+              <w:t>Expected credit losses (approved set)</w:t>
             </w:r>
           </w:p>
         </w:tc>
@@ -294,7 +294,7 @@
                 <w:color w:val="222222"/>
                 <w:sz w:val="19"/>
               </w:rPr>
-              <w:t>$1.26 million</w:t>
+              <w:t>$44,878</w:t>
             </w:r>
           </w:p>
         </w:tc>
@@ -332,7 +332,7 @@
                 <w:color w:val="222222"/>
                 <w:sz w:val="19"/>
               </w:rPr>
-              <w:t>$3.13 million</w:t>
+              <w:t>$268,162</w:t>
             </w:r>
           </w:p>
         </w:tc>
@@ -370,7 +370,7 @@
                 <w:color w:val="222222"/>
                 <w:sz w:val="19"/>
               </w:rPr>
-              <w:t>5.00%  (binding constraint)</w:t>
+              <w:t>3.31%  (below 5% cap)</w:t>
             </w:r>
           </w:p>
         </w:tc>
@@ -408,7 +408,7 @@
                 <w:color w:val="222222"/>
                 <w:sz w:val="19"/>
               </w:rPr>
-              <w:t>3,467  (11.6%)</w:t>
+              <w:t>3,792  (12.6%)</w:t>
             </w:r>
           </w:p>
         </w:tc>
@@ -1136,7 +1136,7 @@
                 <w:color w:val="222222"/>
                 <w:sz w:val="19"/>
               </w:rPr>
-              <w:t>$40 fixed</w:t>
+              <w:t>$40 flat event profit</w:t>
             </w:r>
           </w:p>
         </w:tc>
@@ -1154,7 +1154,7 @@
                 <w:color w:val="222222"/>
                 <w:sz w:val="19"/>
               </w:rPr>
-              <w:t>Monte Carlo NPV of revenue minus expected credit loss</w:t>
+              <w:t>$40 NPV-discounted at 19%; expected credit loss deducted per Monte Carlo draws</w:t>
             </w:r>
           </w:p>
         </w:tc>
@@ -1172,7 +1172,7 @@
                 <w:color w:val="222222"/>
                 <w:sz w:val="19"/>
               </w:rPr>
-              <w:t>Fixed $40 does not account for limit size or utilisation — a larger increase on a high-utilisation customer generates far more than $40. We model incremental revenue as interest income on drawn balance.</w:t>
+              <w:t>Implemented as specified. The $40 is the profit from the increase event; expected loss (utilisation-adjusted default × LGD) is subtracted to give net expected profit per customer.</w:t>
             </w:r>
           </w:p>
         </w:tc>
@@ -1228,7 +1228,7 @@
                 <w:color w:val="222222"/>
                 <w:sz w:val="19"/>
               </w:rPr>
-              <w:t>12% annual (NPV_DISCOUNT_RATE)</w:t>
+              <w:t>19% annual  (aligned with brief)</w:t>
             </w:r>
           </w:p>
         </w:tc>
@@ -1246,7 +1246,7 @@
                 <w:color w:val="222222"/>
                 <w:sz w:val="19"/>
               </w:rPr>
-              <w:t>We modelled the cost of capital at 12%. The 19% rate was noted; sensitivity to this is straightforward — higher discount rate reduces the NPV of future cash flows and tightens approvals.</w:t>
+              <w:t>NPV factor applied to both revenue and loss cash flows: (1 − e^{−0.19}) / 0.19 ≈ 0.911.</w:t>
             </w:r>
           </w:p>
         </w:tc>
@@ -4546,11 +4546,9 @@
         <w:br/>
         <w:t xml:space="preserve">  2.  balance   =  U_ij × L_i                           [drawn balance]</w:t>
         <w:br/>
-        <w:t xml:space="preserve">  3.  revenue   =  balance × r_interest × T             [interest income]</w:t>
+        <w:t xml:space="preserve">  3.  revenue   =  $40  (flat profit per limit increase event, per brief)</w:t>
         <w:br/>
-        <w:t xml:space="preserve">                +  L_i × 0.005                          [facility fee, 0.5% annual]</w:t>
-        <w:br/>
-        <w:t xml:space="preserve">  4.  p_default =  clip(default_risk_i × (1 + 0.3 × U_ij), 0, 0.99)</w:t>
+        <w:t xml:space="preserve">  4.  p_default =  clip(default_risk_i × (1 + base_rate_s × U_ij), 0, 0.60)</w:t>
         <w:br/>
         <w:t xml:space="preserve">                   [utilisation-adjusted default probability]</w:t>
         <w:br/>
@@ -4558,7 +4556,9 @@
         <w:br/>
         <w:t xml:space="preserve">  6.  loss      =  D_ij × balance × LGD                 [LGD = 0.50]</w:t>
         <w:br/>
-        <w:t xml:space="preserve">  7.  NPV_ij    =  (revenue - loss) / (1 + r_discount)  [r_discount = 0.12]</w:t>
+        <w:t xml:space="preserve">  7.  NPV_ij    =  (revenue - loss) × npv_factor        [discount rate = 19%]</w:t>
+        <w:br/>
+        <w:t xml:space="preserve">                   npv_factor = (1 − e^{−0.19}) / 0.19  ≈ 0.911</w:t>
       </w:r>
     </w:p>
     <w:p>
@@ -4930,7 +4930,7 @@
           <w:color w:val="888888"/>
           <w:sz w:val="18"/>
         </w:rPr>
-        <w:t>Figure 8. Distribution of limit increases among the 8,766 approved customers.</w:t>
+        <w:t>Figure 8. Distribution of limit increases among the 8,593 approved customers.</w:t>
       </w:r>
     </w:p>
     <w:p>
@@ -5100,7 +5100,7 @@
                 <w:color w:val="222222"/>
                 <w:sz w:val="19"/>
               </w:rPr>
-              <w:t>8,766  (29.2%)</w:t>
+              <w:t>8,593  (28.6%)</w:t>
             </w:r>
           </w:p>
         </w:tc>
@@ -5158,7 +5158,7 @@
                 <w:color w:val="222222"/>
                 <w:sz w:val="19"/>
               </w:rPr>
-              <w:t>Expected incremental revenue</w:t>
+              <w:t>Revenue  ($40 × 8,593, discounted)</w:t>
             </w:r>
           </w:p>
         </w:tc>
@@ -5176,7 +5176,7 @@
                 <w:color w:val="222222"/>
                 <w:sz w:val="19"/>
               </w:rPr>
-              <w:t>$4.39 million</w:t>
+              <w:t>$313,040</w:t>
             </w:r>
           </w:p>
         </w:tc>
@@ -5196,7 +5196,7 @@
                 <w:color w:val="222222"/>
                 <w:sz w:val="19"/>
               </w:rPr>
-              <w:t>Expected credit losses</w:t>
+              <w:t>Expected credit losses (approved set)</w:t>
             </w:r>
           </w:p>
         </w:tc>
@@ -5214,7 +5214,7 @@
                 <w:color w:val="222222"/>
                 <w:sz w:val="19"/>
               </w:rPr>
-              <w:t>$1.26 million</w:t>
+              <w:t>$44,878</w:t>
             </w:r>
           </w:p>
         </w:tc>
@@ -5252,7 +5252,7 @@
                 <w:color w:val="222222"/>
                 <w:sz w:val="19"/>
               </w:rPr>
-              <w:t>$3.13 million</w:t>
+              <w:t>$268,162</w:t>
             </w:r>
           </w:p>
         </w:tc>
@@ -5290,7 +5290,7 @@
                 <w:color w:val="222222"/>
                 <w:sz w:val="19"/>
               </w:rPr>
-              <w:t>5.00%  (binding — LP at boundary)</w:t>
+              <w:t>3.31%  (below 5% cap)</w:t>
             </w:r>
           </w:p>
         </w:tc>
@@ -5328,7 +5328,7 @@
                 <w:color w:val="222222"/>
                 <w:sz w:val="19"/>
               </w:rPr>
-              <w:t>3,467  (11.6%)</w:t>
+              <w:t>3,792  (12.6%)</w:t>
             </w:r>
           </w:p>
         </w:tc>
@@ -5503,7 +5503,7 @@
         </w:tc>
         <w:tc>
           <w:tcPr>
-            <w:tcW w:type="dxa" w:w="2592"/>
+            <w:tcW w:type="dxa" w:w="2016"/>
             <w:shd w:val="clear" w:color="auto" w:fill="1A355E"/>
           </w:tcPr>
           <w:p>
@@ -5516,7 +5516,7 @@
                 <w:color w:val="FFFFFF"/>
                 <w:sz w:val="19"/>
               </w:rPr>
-              <w:t>Mean default risk</w:t>
+              <w:t>Net profit</w:t>
             </w:r>
           </w:p>
         </w:tc>
@@ -5572,7 +5572,7 @@
                 <w:color w:val="222222"/>
                 <w:sz w:val="19"/>
               </w:rPr>
-              <w:t>127</w:t>
+              <w:t>3,134</w:t>
             </w:r>
           </w:p>
         </w:tc>
@@ -5590,7 +5590,7 @@
                 <w:color w:val="222222"/>
                 <w:sz w:val="19"/>
               </w:rPr>
-              <w:t>2.0%</w:t>
+              <w:t>50.2%</w:t>
             </w:r>
           </w:p>
         </w:tc>
@@ -5608,13 +5608,13 @@
                 <w:color w:val="222222"/>
                 <w:sz w:val="19"/>
               </w:rPr>
-              <w:t>$1,001</w:t>
+              <w:t>$48,344</w:t>
             </w:r>
           </w:p>
         </w:tc>
         <w:tc>
           <w:tcPr>
-            <w:tcW w:type="dxa" w:w="2592"/>
+            <w:tcW w:type="dxa" w:w="2016"/>
             <w:shd w:val="clear" w:color="auto" w:fill="FFFFFF"/>
           </w:tcPr>
           <w:p>
@@ -5626,7 +5626,7 @@
                 <w:color w:val="222222"/>
                 <w:sz w:val="19"/>
               </w:rPr>
-              <w:t>~1.0%</w:t>
+              <w:t>$110,862</w:t>
             </w:r>
           </w:p>
         </w:tc>
@@ -5682,7 +5682,7 @@
                 <w:color w:val="222222"/>
                 <w:sz w:val="19"/>
               </w:rPr>
-              <w:t>2,149</w:t>
+              <w:t>3,685</w:t>
             </w:r>
           </w:p>
         </w:tc>
@@ -5700,7 +5700,7 @@
                 <w:color w:val="222222"/>
                 <w:sz w:val="19"/>
               </w:rPr>
-              <w:t>24.7%</w:t>
+              <w:t>42.3%</w:t>
             </w:r>
           </w:p>
         </w:tc>
@@ -5718,13 +5718,13 @@
                 <w:color w:val="222222"/>
                 <w:sz w:val="19"/>
               </w:rPr>
-              <w:t>$11,883</w:t>
+              <w:t>$48,549</w:t>
             </w:r>
           </w:p>
         </w:tc>
         <w:tc>
           <w:tcPr>
-            <w:tcW w:type="dxa" w:w="2592"/>
+            <w:tcW w:type="dxa" w:w="2016"/>
             <w:shd w:val="clear" w:color="auto" w:fill="EEF2F8"/>
           </w:tcPr>
           <w:p>
@@ -5736,7 +5736,7 @@
                 <w:color w:val="222222"/>
                 <w:sz w:val="19"/>
               </w:rPr>
-              <w:t>~2.5%</w:t>
+              <w:t>$117,721</w:t>
             </w:r>
           </w:p>
         </w:tc>
@@ -5792,7 +5792,7 @@
                 <w:color w:val="222222"/>
                 <w:sz w:val="19"/>
               </w:rPr>
-              <w:t>6,017</w:t>
+              <w:t>1,717</w:t>
             </w:r>
           </w:p>
         </w:tc>
@@ -5810,7 +5810,7 @@
                 <w:color w:val="222222"/>
                 <w:sz w:val="19"/>
               </w:rPr>
-              <w:t>68.7%</w:t>
+              <w:t>19.6%</w:t>
             </w:r>
           </w:p>
         </w:tc>
@@ -5828,13 +5828,13 @@
                 <w:color w:val="222222"/>
                 <w:sz w:val="19"/>
               </w:rPr>
-              <w:t>$32,549</w:t>
+              <w:t>$49,037</w:t>
             </w:r>
           </w:p>
         </w:tc>
         <w:tc>
           <w:tcPr>
-            <w:tcW w:type="dxa" w:w="2592"/>
+            <w:tcW w:type="dxa" w:w="2016"/>
             <w:shd w:val="clear" w:color="auto" w:fill="FFFFFF"/>
           </w:tcPr>
           <w:p>
@@ -5846,7 +5846,7 @@
                 <w:color w:val="222222"/>
                 <w:sz w:val="19"/>
               </w:rPr>
-              <w:t>~6.0%</w:t>
+              <w:t>$38,930</w:t>
             </w:r>
           </w:p>
         </w:tc>
@@ -5902,7 +5902,7 @@
                 <w:color w:val="222222"/>
                 <w:sz w:val="19"/>
               </w:rPr>
-              <w:t>473</w:t>
+              <w:t>57</w:t>
             </w:r>
           </w:p>
         </w:tc>
@@ -5920,7 +5920,7 @@
                 <w:color w:val="222222"/>
                 <w:sz w:val="19"/>
               </w:rPr>
-              <w:t>7.5%</w:t>
+              <w:t>0.9%</w:t>
             </w:r>
           </w:p>
         </w:tc>
@@ -5938,13 +5938,13 @@
                 <w:color w:val="222222"/>
                 <w:sz w:val="19"/>
               </w:rPr>
-              <w:t>$3,611</w:t>
+              <w:t>$49,418</w:t>
             </w:r>
           </w:p>
         </w:tc>
         <w:tc>
           <w:tcPr>
-            <w:tcW w:type="dxa" w:w="2592"/>
+            <w:tcW w:type="dxa" w:w="2016"/>
             <w:shd w:val="clear" w:color="auto" w:fill="EEF2F8"/>
           </w:tcPr>
           <w:p>
@@ -5956,7 +5956,7 @@
                 <w:color w:val="222222"/>
                 <w:sz w:val="19"/>
               </w:rPr>
-              <w:t>~16%</w:t>
+              <w:t>$650</w:t>
             </w:r>
           </w:p>
         </w:tc>
@@ -5976,7 +5976,7 @@
           <w:color w:val="222222"/>
           <w:sz w:val="21"/>
         </w:rPr>
-        <w:t>The LP concentrates approvals in the Fair segment — these customers have the highest profitability scores (driven by higher expected utilisation) while their individual default risk (7%) is still below the portfolio cap (5% is a weighted average). Excellent customers receive few increases because they have low utilisation forecasts (30%) and thus low revenue potential per dollar of new exposure. Poor customers are largely excluded because their 18% individual default risk consumes too much of the portfolio risk budget.</w:t>
+        <w:t>With $40 flat revenue per increase, the binding constraint is profitability — not the 5% risk cap. The LP approves a customer only when the discounted $40 profit exceeds expected credit loss. Excellent and Good customers are approved at high rates (50% and 42%) because their low default risk keeps expected losses well below $36.43 (NPV of $40 at 19%). Fair customers are approved selectively (20%) — those with smaller loan balances or above-average payment rates where expected loss stays under $36.43. Poor customers are almost entirely declined (0.9%) because their expected credit loss (~$133 per customer) far exceeds the $40 revenue. Portfolio default risk sits at 3.31% — below the 5% cap — confirming the LP is profitability-constrained, not risk-constrained, under the $40 revenue model. largely excluded because their 18% individual default risk consumes too much of the portfolio risk budget.</w:t>
       </w:r>
     </w:p>
     <w:p>
@@ -6702,7 +6702,7 @@
                 <w:color w:val="222222"/>
                 <w:sz w:val="19"/>
               </w:rPr>
-              <w:t>~9,200</w:t>
+              <w:t>~9,100</w:t>
             </w:r>
           </w:p>
         </w:tc>
@@ -6720,7 +6720,7 @@
                 <w:color w:val="222222"/>
                 <w:sz w:val="19"/>
               </w:rPr>
-              <w:t>8,766</w:t>
+              <w:t>8,593</w:t>
             </w:r>
           </w:p>
         </w:tc>
@@ -6738,7 +6738,7 @@
                 <w:color w:val="222222"/>
                 <w:sz w:val="19"/>
               </w:rPr>
-              <w:t>~7,800</w:t>
+              <w:t>~8,100</w:t>
             </w:r>
           </w:p>
         </w:tc>
@@ -6794,7 +6794,7 @@
                 <w:color w:val="222222"/>
                 <w:sz w:val="19"/>
               </w:rPr>
-              <w:t>$3.13M</w:t>
+              <w:t>$268K</w:t>
             </w:r>
           </w:p>
         </w:tc>
@@ -6927,7 +6927,7 @@
           <w:color w:val="222222"/>
           <w:sz w:val="21"/>
         </w:rPr>
-        <w:t>The optimal strategy under baseline conditions approves 8,766 customers (29.2%) for limit increases, concentrating approvals in the Fair credit state where the risk-return trade-off is most favourable. The LP pushes the portfolio to exactly the 5% risk boundary, meaning no additional approval is possible without violating the constraint. The recommended policy generates $3.13M net expected profit on $417M incremental exposure.</w:t>
+        <w:t>The optimal strategy under baseline conditions approves 8,593 customers (28.6%), concentrating on Excellent and Good customers where the $40 event profit comfortably exceeds expected credit loss. The binding constraint is profitability, not the 5% risk cap — portfolio risk settles at 3.31%, leaving 1.7 pp of risk headroom. Net expected profit is $268,162 on $417M incremental exposure.</w:t>
       </w:r>
     </w:p>
     <w:p>
@@ -6939,7 +6939,7 @@
           <w:color w:val="222222"/>
           <w:sz w:val="21"/>
         </w:rPr>
-        <w:t>Practically: approve all customers with credit_state = Fair and default_risk &lt; 8%, a targeted subset of Good-state customers with high profitability scores, and a small number of Poor-state customers whose individual risk is manageable within the remaining portfolio risk headroom. Decline all ineligible customers (days_since_last_loan &lt; 60).</w:t>
+        <w:t>Decision rule: approve a customer if expected_credit_loss &lt; $36.43 (NPV of $40 at 19%). This naturally approves ~50% of Excellent, ~42% of Good, ~20% of Fair, and ~1% of Poor customers. All ineligible customers (days_since_last_loan &lt; 60) receive no increase.</w:t>
       </w:r>
     </w:p>
     <w:p>
@@ -7484,7 +7484,7 @@
           <w:color w:val="222222"/>
           <w:sz w:val="21"/>
         </w:rPr>
-        <w:t>Discount rate (12%) deviates from the brief's specified 19%. At 19%, NPV estimates are lower, fewer marginal customers pass the profitability threshold, and approval numbers would fall by an estimated 5–10%.</w:t>
+        <w:t>Revenue model is profitability-constrained, not risk-constrained. With $40 flat revenue, the portfolio risk cap (5%) is not the binding limit — expected loss exceeds $40 for most Fair and Poor customers, so the LP declines them on profitability grounds before the risk constraint bites. Portfolio risk settles at 3.31%. The risk budget is not fully utilised, which is a conservative outcome.</w:t>
       </w:r>
     </w:p>
     <w:p>

</xml_diff>